<commit_message>
Fix Word doc: add clickable hyperlinks for all external and internal citations
All 7 external links (Orbit Media, Ahrefs, HubSpot, Google Keyword Planner,
Google Search Essentials, Springer, Backlinko) and 3 internal links
(AI Blog Generator) now use proper ExternalHyperlink elements.

Co-Authored-By: Claude Opus 4.6 <noreply@anthropic.com>
Claude-Session: https://claude.ai/code/session_012jX8bmSNRmEaK3kdhxwfZr
</commit_message>
<xml_diff>
--- a/blog-content/How-to-Write-a-Blog-Post-Using-AI.docx
+++ b/blog-content/How-to-Write-a-Blog-Post-Using-AI.docx
@@ -206,7 +206,33 @@
           <w:sz w:val="22"/>
           <w:szCs w:val="22"/>
         </w:rPr>
-        <w:t xml:space="preserve">95% of bloggers now use AI somewhere in their writing process, according to Orbit Media’s 2025 annual survey. That number was 43% just two years ago.</w:t>
+        <w:t xml:space="preserve">95% of bloggers now use AI somewhere in their writing process, according to </w:t>
+      </w:r>
+      <w:hyperlink w:history="1" r:id="rIdowkjdweg2pge18gwxbilj">
+        <w:r>
+          <w:rPr>
+            <w:rStyle w:val="Hyperlink"/>
+            <w:rFonts w:ascii="Calibri" w:cs="Calibri" w:eastAsia="Calibri" w:hAnsi="Calibri"/>
+            <w:color w:val="7C3AED"/>
+            <w:sz w:val="22"/>
+            <w:szCs w:val="22"/>
+            <w:u w:val="single"/>
+          </w:rPr>
+          <w:t xml:space="preserve">Orbit Media’s 2025 annual survey</w:t>
+        </w:r>
+      </w:hyperlink>
+      <w:r>
+        <w:rPr>
+          <w:rFonts w:ascii="Calibri" w:cs="Calibri" w:eastAsia="Calibri" w:hAnsi="Calibri"/>
+          <w:b w:val="false"/>
+          <w:bCs w:val="false"/>
+          <w:i w:val="false"/>
+          <w:iCs w:val="false"/>
+          <w:color w:val="1A1A2E"/>
+          <w:sz w:val="22"/>
+          <w:szCs w:val="22"/>
+        </w:rPr>
+        <w:t xml:space="preserve">. That number was 43% just two years ago.</w:t>
       </w:r>
     </w:p>
     <w:p>
@@ -323,7 +349,33 @@
           <w:sz w:val="22"/>
           <w:szCs w:val="22"/>
         </w:rPr>
-        <w:t xml:space="preserve">Content production has shifted. An Ahrefs study of 900,000 pages published in early 2025 found that 74.2% of newly created web pages contain AI-generated content. Only 26% is entirely human-written.</w:t>
+        <w:t xml:space="preserve">Content production has shifted. </w:t>
+      </w:r>
+      <w:hyperlink w:history="1" r:id="rIdyuwpo4cutqqanwa3mywq4">
+        <w:r>
+          <w:rPr>
+            <w:rStyle w:val="Hyperlink"/>
+            <w:rFonts w:ascii="Calibri" w:cs="Calibri" w:eastAsia="Calibri" w:hAnsi="Calibri"/>
+            <w:color w:val="7C3AED"/>
+            <w:sz w:val="22"/>
+            <w:szCs w:val="22"/>
+            <w:u w:val="single"/>
+          </w:rPr>
+          <w:t xml:space="preserve">An Ahrefs study of 900,000 pages</w:t>
+        </w:r>
+      </w:hyperlink>
+      <w:r>
+        <w:rPr>
+          <w:rFonts w:ascii="Calibri" w:cs="Calibri" w:eastAsia="Calibri" w:hAnsi="Calibri"/>
+          <w:b w:val="false"/>
+          <w:bCs w:val="false"/>
+          <w:i w:val="false"/>
+          <w:iCs w:val="false"/>
+          <w:color w:val="1A1A2E"/>
+          <w:sz w:val="22"/>
+          <w:szCs w:val="22"/>
+        </w:rPr>
+        <w:t xml:space="preserve"> published in early 2025 found that 74.2% of newly created web pages contain AI-generated content. Only 26% is entirely human-written.</w:t>
       </w:r>
     </w:p>
     <w:p>
@@ -361,7 +413,33 @@
           <w:sz w:val="22"/>
           <w:szCs w:val="22"/>
         </w:rPr>
-        <w:t xml:space="preserve">The bloggers seeing results treat AI as a drafting partner, not a replacement. According to HubSpot’s research on AI in content marketing, 55% of marketers use AI specifically for content creation and 47% use it for research. They use it for:</w:t>
+        <w:t xml:space="preserve">The bloggers seeing results treat AI as a drafting partner, not a replacement. According to </w:t>
+      </w:r>
+      <w:hyperlink w:history="1" r:id="rId7lvbtod52nsk4cdzwf3gv">
+        <w:r>
+          <w:rPr>
+            <w:rStyle w:val="Hyperlink"/>
+            <w:rFonts w:ascii="Calibri" w:cs="Calibri" w:eastAsia="Calibri" w:hAnsi="Calibri"/>
+            <w:color w:val="7C3AED"/>
+            <w:sz w:val="22"/>
+            <w:szCs w:val="22"/>
+            <w:u w:val="single"/>
+          </w:rPr>
+          <w:t xml:space="preserve">HubSpot’s research on AI in content marketing</w:t>
+        </w:r>
+      </w:hyperlink>
+      <w:r>
+        <w:rPr>
+          <w:rFonts w:ascii="Calibri" w:cs="Calibri" w:eastAsia="Calibri" w:hAnsi="Calibri"/>
+          <w:b w:val="false"/>
+          <w:bCs w:val="false"/>
+          <w:i w:val="false"/>
+          <w:iCs w:val="false"/>
+          <w:color w:val="1A1A2E"/>
+          <w:sz w:val="22"/>
+          <w:szCs w:val="22"/>
+        </w:rPr>
+        <w:t xml:space="preserve">, 55% of marketers use AI specifically for content creation and 47% use it for research. They use it for:</w:t>
       </w:r>
     </w:p>
     <w:p>
@@ -692,7 +770,33 @@
           <w:sz w:val="22"/>
           <w:szCs w:val="22"/>
         </w:rPr>
-        <w:t xml:space="preserve">Next, validate with free tools. Drop each search query into Google Keyword Planner or Ubersuggest. Look for:</w:t>
+        <w:t xml:space="preserve">Next, validate with free tools. Drop each search query into </w:t>
+      </w:r>
+      <w:hyperlink w:history="1" r:id="rIdvwyet96o84zg0-qavfpgz">
+        <w:r>
+          <w:rPr>
+            <w:rStyle w:val="Hyperlink"/>
+            <w:rFonts w:ascii="Calibri" w:cs="Calibri" w:eastAsia="Calibri" w:hAnsi="Calibri"/>
+            <w:color w:val="7C3AED"/>
+            <w:sz w:val="22"/>
+            <w:szCs w:val="22"/>
+            <w:u w:val="single"/>
+          </w:rPr>
+          <w:t xml:space="preserve">Google Keyword Planner</w:t>
+        </w:r>
+      </w:hyperlink>
+      <w:r>
+        <w:rPr>
+          <w:rFonts w:ascii="Calibri" w:cs="Calibri" w:eastAsia="Calibri" w:hAnsi="Calibri"/>
+          <w:b w:val="false"/>
+          <w:bCs w:val="false"/>
+          <w:i w:val="false"/>
+          <w:iCs w:val="false"/>
+          <w:color w:val="1A1A2E"/>
+          <w:sz w:val="22"/>
+          <w:szCs w:val="22"/>
+        </w:rPr>
+        <w:t xml:space="preserve"> or Ubersuggest. Look for:</w:t>
       </w:r>
     </w:p>
     <w:p>
@@ -2330,7 +2434,33 @@
           <w:sz w:val="22"/>
           <w:szCs w:val="22"/>
         </w:rPr>
-        <w:t xml:space="preserve">Google’s Search Essentials documentation focuses on content quality, not content origin. Their Helpful Content System, now integrated into the core ranking algorithm, evaluates whether content demonstrates genuine expertise, provides original value, and satisfies the searcher’s intent.</w:t>
+        <w:t xml:space="preserve">Google’s </w:t>
+      </w:r>
+      <w:hyperlink w:history="1" r:id="rIdcnnjwbueauw3kepnbdi8k">
+        <w:r>
+          <w:rPr>
+            <w:rStyle w:val="Hyperlink"/>
+            <w:rFonts w:ascii="Calibri" w:cs="Calibri" w:eastAsia="Calibri" w:hAnsi="Calibri"/>
+            <w:color w:val="7C3AED"/>
+            <w:sz w:val="22"/>
+            <w:szCs w:val="22"/>
+            <w:u w:val="single"/>
+          </w:rPr>
+          <w:t xml:space="preserve">Search Essentials documentation</w:t>
+        </w:r>
+      </w:hyperlink>
+      <w:r>
+        <w:rPr>
+          <w:rFonts w:ascii="Calibri" w:cs="Calibri" w:eastAsia="Calibri" w:hAnsi="Calibri"/>
+          <w:b w:val="false"/>
+          <w:bCs w:val="false"/>
+          <w:i w:val="false"/>
+          <w:iCs w:val="false"/>
+          <w:color w:val="1A1A2E"/>
+          <w:sz w:val="22"/>
+          <w:szCs w:val="22"/>
+        </w:rPr>
+        <w:t xml:space="preserve"> focuses on content quality, not content origin. Their Helpful Content System, now integrated into the core ranking algorithm, evaluates whether content demonstrates genuine expertise, provides original value, and satisfies the searcher’s intent.</w:t>
       </w:r>
     </w:p>
     <w:p>
@@ -2514,7 +2644,33 @@
           <w:sz w:val="22"/>
           <w:szCs w:val="22"/>
         </w:rPr>
-        <w:t xml:space="preserve">A peer-reviewed study in the International Journal for Educational Integrity tested major AI detection tools and found that all scored below 80% accuracy — only five managed to clear 70%. Some flagged clearly human-written text as AI-generated. If dedicated detection tools can’t reliably tell the difference, content quality is the only signal that matters.</w:t>
+        <w:t xml:space="preserve">A </w:t>
+      </w:r>
+      <w:hyperlink w:history="1" r:id="rId3ryv1wsclm1fqucpdkreu">
+        <w:r>
+          <w:rPr>
+            <w:rStyle w:val="Hyperlink"/>
+            <w:rFonts w:ascii="Calibri" w:cs="Calibri" w:eastAsia="Calibri" w:hAnsi="Calibri"/>
+            <w:color w:val="7C3AED"/>
+            <w:sz w:val="22"/>
+            <w:szCs w:val="22"/>
+            <w:u w:val="single"/>
+          </w:rPr>
+          <w:t xml:space="preserve">peer-reviewed study in the International Journal for Educational Integrity</w:t>
+        </w:r>
+      </w:hyperlink>
+      <w:r>
+        <w:rPr>
+          <w:rFonts w:ascii="Calibri" w:cs="Calibri" w:eastAsia="Calibri" w:hAnsi="Calibri"/>
+          <w:b w:val="false"/>
+          <w:bCs w:val="false"/>
+          <w:i w:val="false"/>
+          <w:iCs w:val="false"/>
+          <w:color w:val="1A1A2E"/>
+          <w:sz w:val="22"/>
+          <w:szCs w:val="22"/>
+        </w:rPr>
+        <w:t xml:space="preserve"> tested major AI detection tools and found that all scored below 80% accuracy — only five managed to clear 70%. Some flagged clearly human-written text as AI-generated. If dedicated detection tools can’t reliably tell the difference, content quality is the only signal that matters.</w:t>
       </w:r>
     </w:p>
     <w:p>
@@ -3995,7 +4151,33 @@
           <w:sz w:val="22"/>
           <w:szCs w:val="22"/>
         </w:rPr>
-        <w:t xml:space="preserve">A practical workflow using only free tools: brainstorm topics in ChatGPT, research in Perplexity (with built-in citations), generate a full draft in BrightlyFuture’s AI Blog Generator, humanize the output by editing manually, check readability in Hemingway, and optimize SEO with Yoast’s free WordPress plugin.</w:t>
+        <w:t xml:space="preserve">A practical workflow using only free tools: brainstorm topics in ChatGPT, research in Perplexity (with built-in citations), generate a full draft in </w:t>
+      </w:r>
+      <w:hyperlink w:history="1" r:id="rIdn_ytrp4j9ykkzqwwsqwmg">
+        <w:r>
+          <w:rPr>
+            <w:rStyle w:val="Hyperlink"/>
+            <w:rFonts w:ascii="Calibri" w:cs="Calibri" w:eastAsia="Calibri" w:hAnsi="Calibri"/>
+            <w:color w:val="7C3AED"/>
+            <w:sz w:val="22"/>
+            <w:szCs w:val="22"/>
+            <w:u w:val="single"/>
+          </w:rPr>
+          <w:t xml:space="preserve">BrightlyFuture’s AI Blog Generator</w:t>
+        </w:r>
+      </w:hyperlink>
+      <w:r>
+        <w:rPr>
+          <w:rFonts w:ascii="Calibri" w:cs="Calibri" w:eastAsia="Calibri" w:hAnsi="Calibri"/>
+          <w:b w:val="false"/>
+          <w:bCs w:val="false"/>
+          <w:i w:val="false"/>
+          <w:iCs w:val="false"/>
+          <w:color w:val="1A1A2E"/>
+          <w:sz w:val="22"/>
+          <w:szCs w:val="22"/>
+        </w:rPr>
+        <w:t xml:space="preserve">, humanize the output by editing manually, check readability in Hemingway, and optimize SEO with Yoast’s free WordPress plugin.</w:t>
       </w:r>
     </w:p>
     <w:p>
@@ -4265,7 +4447,33 @@
           <w:sz w:val="22"/>
           <w:szCs w:val="22"/>
         </w:rPr>
-        <w:t xml:space="preserve">Match the depth of the topic, not a word count target. Supporting articles work well at 1,500-2,000 words. Comprehensive guides land between 3,000-4,500 words. Backlinko’s research found the average first-page result is 1,447 words — but ranking depends on quality and completeness, not length alone.</w:t>
+        <w:t xml:space="preserve">Match the depth of the topic, not a word count target. Supporting articles work well at 1,500-2,000 words. Comprehensive guides land between 3,000-4,500 words. </w:t>
+      </w:r>
+      <w:hyperlink w:history="1" r:id="rId0s9j2rl1_iapgs_iycifb">
+        <w:r>
+          <w:rPr>
+            <w:rStyle w:val="Hyperlink"/>
+            <w:rFonts w:ascii="Calibri" w:cs="Calibri" w:eastAsia="Calibri" w:hAnsi="Calibri"/>
+            <w:color w:val="7C3AED"/>
+            <w:sz w:val="22"/>
+            <w:szCs w:val="22"/>
+            <w:u w:val="single"/>
+          </w:rPr>
+          <w:t xml:space="preserve">Backlinko’s research</w:t>
+        </w:r>
+      </w:hyperlink>
+      <w:r>
+        <w:rPr>
+          <w:rFonts w:ascii="Calibri" w:cs="Calibri" w:eastAsia="Calibri" w:hAnsi="Calibri"/>
+          <w:b w:val="false"/>
+          <w:bCs w:val="false"/>
+          <w:i w:val="false"/>
+          <w:iCs w:val="false"/>
+          <w:color w:val="4A5568"/>
+          <w:sz w:val="22"/>
+          <w:szCs w:val="22"/>
+        </w:rPr>
+        <w:t xml:space="preserve"> found the average first-page result is 1,447 words — but ranking depends on quality and completeness, not length alone.</w:t>
       </w:r>
     </w:p>
     <w:p>
@@ -4349,7 +4557,33 @@
           <w:sz w:val="22"/>
           <w:szCs w:val="22"/>
         </w:rPr>
-        <w:t xml:space="preserve">Multiple tools give better results. Use one tool for research (Perplexity works well), a different one for drafting (ChatGPT or an AI blog generator), and a separate editing tool (Grammarly or Hemingway) for polish. Each tool has a strength — stacking them covers weaknesses that any single tool leaves exposed.</w:t>
+        <w:t xml:space="preserve">Multiple tools give better results. Use one tool for research (Perplexity works well), a different one for drafting (ChatGPT or an </w:t>
+      </w:r>
+      <w:hyperlink w:history="1" r:id="rId6rs961j_at4zizi6tloxg">
+        <w:r>
+          <w:rPr>
+            <w:rStyle w:val="Hyperlink"/>
+            <w:rFonts w:ascii="Calibri" w:cs="Calibri" w:eastAsia="Calibri" w:hAnsi="Calibri"/>
+            <w:color w:val="7C3AED"/>
+            <w:sz w:val="22"/>
+            <w:szCs w:val="22"/>
+            <w:u w:val="single"/>
+          </w:rPr>
+          <w:t xml:space="preserve">AI blog generator</w:t>
+        </w:r>
+      </w:hyperlink>
+      <w:r>
+        <w:rPr>
+          <w:rFonts w:ascii="Calibri" w:cs="Calibri" w:eastAsia="Calibri" w:hAnsi="Calibri"/>
+          <w:b w:val="false"/>
+          <w:bCs w:val="false"/>
+          <w:i w:val="false"/>
+          <w:iCs w:val="false"/>
+          <w:color w:val="4A5568"/>
+          <w:sz w:val="22"/>
+          <w:szCs w:val="22"/>
+        </w:rPr>
+        <w:t xml:space="preserve">), and a separate editing tool (Grammarly or Hemingway) for polish. Each tool has a strength — stacking them covers weaknesses that any single tool leaves exposed.</w:t>
       </w:r>
     </w:p>
     <w:p>
@@ -4573,7 +4807,33 @@
           <w:sz w:val="22"/>
           <w:szCs w:val="22"/>
         </w:rPr>
-        <w:t xml:space="preserve">Need a starting point? Try BrightlyFuture’s free AI Blog Generator — paste your topic, get a full draft in 30 seconds, then follow the humanization framework above to make it yours.</w:t>
+        <w:t xml:space="preserve">Need a starting point? Try </w:t>
+      </w:r>
+      <w:hyperlink w:history="1" r:id="rId7nr1nkcndz__bcl8bf8au">
+        <w:r>
+          <w:rPr>
+            <w:rStyle w:val="Hyperlink"/>
+            <w:rFonts w:ascii="Calibri" w:cs="Calibri" w:eastAsia="Calibri" w:hAnsi="Calibri"/>
+            <w:color w:val="7C3AED"/>
+            <w:sz w:val="22"/>
+            <w:szCs w:val="22"/>
+            <w:u w:val="single"/>
+          </w:rPr>
+          <w:t xml:space="preserve">BrightlyFuture’s free AI Blog Generator</w:t>
+        </w:r>
+      </w:hyperlink>
+      <w:r>
+        <w:rPr>
+          <w:rFonts w:ascii="Calibri" w:cs="Calibri" w:eastAsia="Calibri" w:hAnsi="Calibri"/>
+          <w:b w:val="false"/>
+          <w:bCs w:val="false"/>
+          <w:i w:val="false"/>
+          <w:iCs w:val="false"/>
+          <w:color w:val="1A1A2E"/>
+          <w:sz w:val="22"/>
+          <w:szCs w:val="22"/>
+        </w:rPr>
+        <w:t xml:space="preserve"> — paste your topic, get a full draft in 30 seconds, then follow the humanization framework above to make it yours.</w:t>
       </w:r>
     </w:p>
     <w:p>

</xml_diff>

<commit_message>
Audit fixes: remove repeated sentence, replace non-unique FAQ
Removed duplicate "don't write more than one section" sentence
(already stated in prompts section). Replaced FAQ #3 (multiple
tools — already covered in tools section and audit section) with
unique FAQ about realistic posts-per-week output.

Co-Authored-By: Claude Opus 4.6 <noreply@anthropic.com>
Claude-Session: https://claude.ai/code/session_012jX8bmSNRmEaK3kdhxwfZr
</commit_message>
<xml_diff>
--- a/blog-content/How-to-Write-a-Blog-Post-Using-AI.docx
+++ b/blog-content/How-to-Write-a-Blog-Post-Using-AI.docx
@@ -99,7 +99,7 @@
       <w:r>
         <w:t xml:space="preserve">95% of bloggers now use AI somewhere in their writing process, according to </w:t>
       </w:r>
-      <w:hyperlink w:history="1" r:id="rIdhcilgxr80whut4vey04gs">
+      <w:hyperlink w:history="1" r:id="rIdls1ixac0uox3g61cv7glr">
         <w:r>
           <w:rPr>
             <w:color w:val="7C3AED"/>
@@ -165,7 +165,7 @@
       <w:r>
         <w:t xml:space="preserve">Content production has shifted. </w:t>
       </w:r>
-      <w:hyperlink w:history="1" r:id="rIdgyzzggkxq60yvu4_kt8qz">
+      <w:hyperlink w:history="1" r:id="rIdg7hhgywx9pg8ray0x_mi_">
         <w:r>
           <w:rPr>
             <w:color w:val="7C3AED"/>
@@ -191,7 +191,7 @@
       <w:r>
         <w:t xml:space="preserve">The bloggers seeing results treat AI as a drafting partner, not a replacement. According to </w:t>
       </w:r>
-      <w:hyperlink w:history="1" r:id="rIdjoc5klafk9ce2lxdx-hfg">
+      <w:hyperlink w:history="1" r:id="rIdveb53e6h0cgva7devlpc0">
         <w:r>
           <w:rPr>
             <w:color w:val="7C3AED"/>
@@ -377,7 +377,7 @@
       <w:r>
         <w:t xml:space="preserve">If you don't have paid tools, </w:t>
       </w:r>
-      <w:hyperlink w:history="1" r:id="rIddaqmtc-g-3dv6ufymvoth">
+      <w:hyperlink w:history="1" r:id="rIdimlck9gtylcdwkvwqwojr">
         <w:r>
           <w:rPr>
             <w:color w:val="7C3AED"/>
@@ -463,7 +463,7 @@
       <w:r>
         <w:t xml:space="preserve">After keyword selection, I expand the list with real questions people ask. I check Google's "People Also Ask" box for my target keyword and add every relevant question to my spreadsheet. Then I use </w:t>
       </w:r>
-      <w:hyperlink w:history="1" r:id="rId05y75ood7e_3mnas7o8sg">
+      <w:hyperlink w:history="1" r:id="rIddpifapp2ggkfd0azgrbiv">
         <w:r>
           <w:rPr>
             <w:color w:val="7C3AED"/>
@@ -1116,7 +1116,7 @@
         <w:spacing w:after="200"/>
       </w:pPr>
       <w:r>
-        <w:t xml:space="preserve">Work through the article in order — intro first, each body H2 one at a time, conclusion last. Never ask the AI to write more than one section at a time. Longer outputs drift off-topic and fall into generic patterns.</w:t>
+        <w:t xml:space="preserve">Work through the article in order — intro first, each body H2 one at a time, conclusion last.</w:t>
       </w:r>
     </w:p>
     <w:p>
@@ -1647,7 +1647,7 @@
       <w:r>
         <w:t xml:space="preserve">Google's </w:t>
       </w:r>
-      <w:hyperlink w:history="1" r:id="rIdppw_ehz9ywt70hw8atmet">
+      <w:hyperlink w:history="1" r:id="rIdfjq4p8mwi3sezn8urcfas">
         <w:r>
           <w:rPr>
             <w:color w:val="7C3AED"/>
@@ -1749,7 +1749,7 @@
       <w:r>
         <w:t xml:space="preserve">A </w:t>
       </w:r>
-      <w:hyperlink w:history="1" r:id="rIdabjvejvv5pa-izg4ey1-w">
+      <w:hyperlink w:history="1" r:id="rIdiwntrecxvjzmixgjyktir">
         <w:r>
           <w:rPr>
             <w:color w:val="7C3AED"/>
@@ -2728,7 +2728,7 @@
       <w:r>
         <w:t xml:space="preserve">A practical workflow using only free tools: research in Perplexity (with built-in citations), pull the latest data with Grok, draft in Claude with your full competitor analysis and structure, generate a quick draft in </w:t>
       </w:r>
-      <w:hyperlink w:history="1" r:id="rIdlxt-fppdg92mrk8ssjxwv">
+      <w:hyperlink w:history="1" r:id="rIdsebzclywks4ek2hckeanl">
         <w:r>
           <w:rPr>
             <w:color w:val="7C3AED"/>
@@ -2746,7 +2746,7 @@
       <w:r>
         <w:t xml:space="preserve">That workflow costs nothing and covers every step in this guide. Paid tools like </w:t>
       </w:r>
-      <w:hyperlink w:history="1" r:id="rId6lm2d9jdg6lrled3imm0f">
+      <w:hyperlink w:history="1" r:id="rIdxsnxjcnbjtesehpeljjye">
         <w:r>
           <w:rPr>
             <w:color w:val="7C3AED"/>
@@ -2896,7 +2896,7 @@
       <w:r>
         <w:t xml:space="preserve">Match the depth of the topic, not a word count target. Supporting articles work well at 1,500-2,000 words. Comprehensive guides land between 3,000-4,500 words. </w:t>
       </w:r>
-      <w:hyperlink w:history="1" r:id="rId8v07cs2nefexksqyxdmrj">
+      <w:hyperlink w:history="1" r:id="rId_dhh5j9uxbdc_jayods5v">
         <w:r>
           <w:rPr>
             <w:color w:val="7C3AED"/>
@@ -2944,26 +2944,16 @@
           <w:sz w:val="24"/>
           <w:szCs w:val="24"/>
         </w:rPr>
-        <w:t xml:space="preserve">Should I use one AI tool or multiple tools for writing a blog post?</w:t>
-      </w:r>
-    </w:p>
-    <w:p>
-      <w:pPr>
-        <w:spacing w:after="200"/>
-      </w:pPr>
-      <w:r>
-        <w:t xml:space="preserve">Multiple tools give better results. Use one tool for research (Perplexity works well), a different one for drafting (Claude or an </w:t>
-      </w:r>
-      <w:hyperlink w:history="1" r:id="rId_tspg2gbfqgp0z-lax4fd">
-        <w:r>
-          <w:rPr>
-            <w:color w:val="7C3AED"/>
-            <w:u w:val="single"/>
-          </w:rPr>
-          <w:t xml:space="preserve">AI blog generator</w:t>
-        </w:r>
-      </w:hyperlink>
-      <w:r/>
+        <w:t xml:space="preserve">How many blog posts can you realistically write per week using AI?</w:t>
+      </w:r>
+    </w:p>
+    <w:p>
+      <w:pPr>
+        <w:spacing w:after="200"/>
+      </w:pPr>
+      <w:r>
+        <w:t xml:space="preserve">Two to three quality posts per week is realistic for a solo blogger using the workflow in this guide. The research and competitor analysis take 1-2 hours per post, the AI draft takes under an hour, and humanization plus auditing adds another 1-2 hours. That's roughly 4-5 hours per finished post — compared to 8-12 hours writing from scratch. Scaling beyond three posts per week usually requires cutting corners on the audit process, which hurts quality.</w:t>
+      </w:r>
     </w:p>
     <w:p>
       <w:pPr>
@@ -3084,7 +3074,7 @@
       <w:r>
         <w:t xml:space="preserve">Need a starting point? </w:t>
       </w:r>
-      <w:hyperlink w:history="1" r:id="rIdmqdnd3p1t1dvvwh7dwslm">
+      <w:hyperlink w:history="1" r:id="rIdi0ntq1pcg-kkklvb5lxyg">
         <w:r>
           <w:rPr>
             <w:color w:val="7C3AED"/>

</xml_diff>